<commit_message>
ingreso, renovación y cierre de sesión de la consola, y separación de roles (HU-03, CU-03)
</commit_message>
<xml_diff>
--- a/Fase 1/Evidencias Individuales/Aguayo_Nicolas_1.3_APT122_AutoevaluacionFase1.docx
+++ b/Fase 1/Evidencias Individuales/Aguayo_Nicolas_1.3_APT122_AutoevaluacionFase1.docx
@@ -5,21 +5,9 @@
     <w:p>
       <w:pPr>
         <w:spacing w:after="60" w:lineRule="auto"/>
-        <w:jc w:val="center"/>
-        <w:rPr/>
-      </w:pPr>
-      <w:r>
-        <w:rPr>
-          <w:rFonts w:ascii="Calibri" w:cs="Calibri" w:eastAsia="Calibri" w:hAnsi="Calibri"/>
-          <w:b w:val="1"/>
-          <w:bCs w:val="1"/>
-          <w:color w:val="000000"/>
-          <w:sz w:val="30"/>
-          <w:szCs w:val="30"/>
-          <w:rtl w:val="0"/>
-        </w:rPr>
-        <w:t xml:space="preserve">Evaluación Fase 1</w:t>
-      </w:r>
+        <w:jc w:val="left"/>
+        <w:rPr/>
+      </w:pPr>
       <w:r>
         <w:rPr>
           <w:rtl w:val="0"/>
@@ -30,18 +18,37 @@
       <w:pPr>
         <w:spacing w:after="300" w:lineRule="auto"/>
         <w:jc w:val="center"/>
-        <w:rPr/>
-      </w:pPr>
-      <w:r>
-        <w:rPr>
-          <w:rFonts w:ascii="Calibri" w:cs="Calibri" w:eastAsia="Calibri" w:hAnsi="Calibri"/>
+        <w:rPr>
+          <w:b w:val="1"/>
+          <w:bCs w:val="1"/>
           <w:color w:val="000000"/>
           <w:sz w:val="26"/>
           <w:szCs w:val="26"/>
+        </w:rPr>
+      </w:pPr>
+      <w:r>
+        <w:rPr>
+          <w:b w:val="1"/>
+          <w:bCs w:val="1"/>
+          <w:color w:val="000000"/>
+          <w:sz w:val="26"/>
+          <w:szCs w:val="26"/>
           <w:rtl w:val="0"/>
         </w:rPr>
         <w:t xml:space="preserve">Autoevaluación Definición Proyecto APT</w:t>
       </w:r>
+    </w:p>
+    <w:p>
+      <w:pPr>
+        <w:spacing w:after="300" w:lineRule="auto"/>
+        <w:jc w:val="center"/>
+        <w:rPr>
+          <w:b w:val="1"/>
+          <w:bCs w:val="1"/>
+          <w:sz w:val="26"/>
+          <w:szCs w:val="26"/>
+        </w:rPr>
+      </w:pPr>
       <w:r>
         <w:rPr>
           <w:rtl w:val="0"/>
@@ -51,7 +58,7 @@
     <w:tbl>
       <w:tblPr>
         <w:tblStyle w:val="Table1"/>
-        <w:tblW w:w="9350.0" w:type="dxa"/>
+        <w:tblW w:w="9360.0" w:type="dxa"/>
         <w:jc w:val="left"/>
         <w:tblBorders>
           <w:top w:color="000000" w:space="0" w:sz="4" w:val="single"/>
@@ -65,16 +72,18 @@
         <w:tblLook w:val="0000"/>
       </w:tblPr>
       <w:tblGrid>
-        <w:gridCol w:w="1800"/>
-        <w:gridCol w:w="3550"/>
-        <w:gridCol w:w="2000"/>
-        <w:gridCol w:w="2000"/>
+        <w:gridCol w:w="1484.4052863436123"/>
+        <w:gridCol w:w="2927.577092511013"/>
+        <w:gridCol w:w="1649.339207048458"/>
+        <w:gridCol w:w="1649.339207048458"/>
+        <w:gridCol w:w="1649.339207048458"/>
         <w:tblGridChange w:id="0">
           <w:tblGrid>
-            <w:gridCol w:w="1800"/>
-            <w:gridCol w:w="3550"/>
-            <w:gridCol w:w="2000"/>
-            <w:gridCol w:w="2000"/>
+            <w:gridCol w:w="1484.4052863436123"/>
+            <w:gridCol w:w="2927.577092511013"/>
+            <w:gridCol w:w="1649.339207048458"/>
+            <w:gridCol w:w="1649.339207048458"/>
+            <w:gridCol w:w="1649.339207048458"/>
           </w:tblGrid>
         </w:tblGridChange>
       </w:tblGrid>
@@ -247,6 +256,52 @@
             </w:r>
           </w:p>
         </w:tc>
+        <w:tc>
+          <w:tcPr>
+            <w:tcBorders>
+              <w:top w:color="000000" w:space="0" w:sz="4" w:val="single"/>
+              <w:left w:color="000000" w:space="0" w:sz="4" w:val="single"/>
+              <w:bottom w:color="000000" w:space="0" w:sz="4" w:val="single"/>
+              <w:right w:color="000000" w:space="0" w:sz="4" w:val="single"/>
+            </w:tcBorders>
+            <w:shd w:fill="d9d9d9" w:val="clear"/>
+            <w:tcMar>
+              <w:top w:w="80.0" w:type="dxa"/>
+              <w:left w:w="100.0" w:type="dxa"/>
+              <w:bottom w:w="80.0" w:type="dxa"/>
+              <w:right w:w="100.0" w:type="dxa"/>
+            </w:tcMar>
+            <w:vAlign w:val="center"/>
+          </w:tcPr>
+          <w:p>
+            <w:pPr>
+              <w:jc w:val="left"/>
+              <w:rPr>
+                <w:rFonts w:ascii="Calibri" w:cs="Calibri" w:eastAsia="Calibri" w:hAnsi="Calibri"/>
+                <w:b w:val="1"/>
+                <w:bCs w:val="1"/>
+                <w:color w:val="000000"/>
+                <w:sz w:val="22"/>
+                <w:szCs w:val="22"/>
+              </w:rPr>
+            </w:pPr>
+            <w:r>
+              <w:rPr>
+                <w:b w:val="1"/>
+                <w:bCs w:val="1"/>
+                <w:sz w:val="22"/>
+                <w:szCs w:val="22"/>
+                <w:rtl w:val="0"/>
+              </w:rPr>
+              <w:t xml:space="preserve">Nombre</w:t>
+            </w:r>
+            <w:r>
+              <w:rPr>
+                <w:rtl w:val="0"/>
+              </w:rPr>
+            </w:r>
+          </w:p>
+        </w:tc>
       </w:tr>
       <w:tr>
         <w:trPr>
@@ -405,6 +460,49 @@
                 <w:rtl w:val="0"/>
               </w:rPr>
               <w:t xml:space="preserve">0%</w:t>
+            </w:r>
+            <w:r>
+              <w:rPr>
+                <w:rtl w:val="0"/>
+              </w:rPr>
+            </w:r>
+          </w:p>
+        </w:tc>
+        <w:tc>
+          <w:tcPr>
+            <w:tcBorders>
+              <w:top w:color="000000" w:space="0" w:sz="4" w:val="single"/>
+              <w:left w:color="000000" w:space="0" w:sz="4" w:val="single"/>
+              <w:bottom w:color="000000" w:space="0" w:sz="4" w:val="single"/>
+              <w:right w:color="000000" w:space="0" w:sz="4" w:val="single"/>
+            </w:tcBorders>
+            <w:tcMar>
+              <w:top w:w="80.0" w:type="dxa"/>
+              <w:left w:w="100.0" w:type="dxa"/>
+              <w:bottom w:w="80.0" w:type="dxa"/>
+              <w:right w:w="100.0" w:type="dxa"/>
+            </w:tcMar>
+            <w:vAlign w:val="center"/>
+          </w:tcPr>
+          <w:p>
+            <w:pPr>
+              <w:jc w:val="left"/>
+              <w:rPr>
+                <w:rFonts w:ascii="Calibri" w:cs="Calibri" w:eastAsia="Calibri" w:hAnsi="Calibri"/>
+                <w:b w:val="0"/>
+                <w:bCs w:val="0"/>
+                <w:color w:val="000000"/>
+                <w:sz w:val="22"/>
+                <w:szCs w:val="22"/>
+              </w:rPr>
+            </w:pPr>
+            <w:r>
+              <w:rPr>
+                <w:sz w:val="22"/>
+                <w:szCs w:val="22"/>
+                <w:rtl w:val="0"/>
+              </w:rPr>
+              <w:t xml:space="preserve">Nicolas Aguayo Valdebenito</w:t>
             </w:r>
             <w:r>
               <w:rPr>

</xml_diff>